<commit_message>
Add patents row; bold focus in bio; unify earlier-work eyebrow
- New Patents credential under peer-review (US 12,518,440 and
  US 11,922,562), one line per patent linking to the public record.
- Bold "Computational Imaging and Neural Rendering" in the bio.
- Earlier-work expand label now matches the peer-review / patents
  eyebrow style (mono micro caps, 700, --fg).
- Refresh CV (docx + pdf).

Co-Authored-By: Claude Opus 4.7 (1M context) <noreply@anthropic.com>
</commit_message>
<xml_diff>
--- a/CV_Lars_Jebe_2026.docx
+++ b/CV_Lars_Jebe_2026.docx
@@ -153,19 +153,31 @@
         <w:rPr>
           <w:i/>
         </w:rPr>
-        <w:t xml:space="preserve">Hi, I'm Lars. I'm an AI engineer building creative tools — most recently four years on Marc Levoy's computational photography team at Adobe, now founding technical staff at Phota Labs. I work </w:t>
+        <w:t xml:space="preserve">Hi, I'm Lars. I'm a research engineer working at the seam between generative-AI research and shipped product. I own the data and vision pipelines, agentic workflows, and inference infrastructure that turn lab-grade techniques into something real users love. Four years on Marc Levoy's computational photography team at Adobe; now founding engineer at Phota Labs, personalizing generative photography to </w:t>
       </w:r>
       <w:r>
         <w:rPr>
           <w:i/>
         </w:rPr>
-        <w:t xml:space="preserve">at </w:t>
+        <w:t>*</w:t>
       </w:r>
       <w:r>
         <w:rPr>
           <w:i/>
         </w:rPr>
-        <w:t>the seam between research and product: taking research-grade techniques and making them survive contact with real users, on real devices, at scale.</w:t>
+        <w:t>you</w:t>
+      </w:r>
+      <w:r>
+        <w:rPr>
+          <w:i/>
+        </w:rPr>
+        <w:t>*</w:t>
+      </w:r>
+      <w:r>
+        <w:rPr>
+          <w:i/>
+        </w:rPr>
+        <w:t>.</w:t>
       </w:r>
     </w:p>
     <w:p>
@@ -532,7 +544,7 @@
         <w:t xml:space="preserve">core </w:t>
       </w:r>
       <w:r>
-        <w:t>contributor on computational pipeline for SLR-like raw and JPEG output on iPhone</w:t>
+        <w:t>developer on computational pipeline for SLR-like raw and JPEG output on iPhone</w:t>
       </w:r>
       <w:r>
         <w:t>, credited</w:t>

</xml_diff>